<commit_message>
perbaiki template surat cuti dan perhitungan kuota cuti tahunan
</commit_message>
<xml_diff>
--- a/storage/app/template/surat_cuti_template.docx
+++ b/storage/app/template/surat_cuti_template.docx
@@ -557,9 +557,9 @@
         <w:tblLook w:val="04A0" w:firstRow="1" w:lastRow="0" w:firstColumn="1" w:lastColumn="0" w:noHBand="0" w:noVBand="1"/>
       </w:tblPr>
       <w:tblGrid>
-        <w:gridCol w:w="1514"/>
-        <w:gridCol w:w="3181"/>
-        <w:gridCol w:w="1750"/>
+        <w:gridCol w:w="1883"/>
+        <w:gridCol w:w="2885"/>
+        <w:gridCol w:w="2030"/>
         <w:gridCol w:w="3398"/>
       </w:tblGrid>
       <w:tr>
@@ -594,7 +594,7 @@
       <w:tr>
         <w:tc>
           <w:tcPr>
-            <w:tcW w:w="1514" w:type="dxa"/>
+            <w:tcW w:w="3510" w:type="dxa"/>
           </w:tcPr>
           <w:p>
             <w:pPr>
@@ -620,7 +620,7 @@
         </w:tc>
         <w:tc>
           <w:tcPr>
-            <w:tcW w:w="3181" w:type="dxa"/>
+            <w:tcW w:w="1276" w:type="dxa"/>
           </w:tcPr>
           <w:p>
             <w:pPr>
@@ -637,13 +637,13 @@
                 <w:sz w:val="18"/>
                 <w:szCs w:val="18"/>
               </w:rPr>
-              <w:t>${CUTI_TAHUNAN}</w:t>
-            </w:r>
-          </w:p>
-        </w:tc>
-        <w:tc>
-          <w:tcPr>
-            <w:tcW w:w="1750" w:type="dxa"/>
+              <w:t xml:space="preserve">${CUTI_TAHUNAN}                                                                                                                                                                                                                                                                                                                                                                                                                                                                                                                                                                                                                                                                                                                                                                                                                                                                                                                                                                                                                                                                                                                                                                                                                                                                                                                                                                                                                                                                                                                                                                                                                                                                                                                                                                                                                                                                                                                                        </w:t>
+            </w:r>
+          </w:p>
+        </w:tc>
+        <w:tc>
+          <w:tcPr>
+            <w:tcW w:w="3402" w:type="dxa"/>
           </w:tcPr>
           <w:p>
             <w:pPr>
@@ -669,7 +669,7 @@
         </w:tc>
         <w:tc>
           <w:tcPr>
-            <w:tcW w:w="3331" w:type="dxa"/>
+            <w:tcW w:w="1588" w:type="dxa"/>
           </w:tcPr>
           <w:p>
             <w:pPr>
@@ -695,7 +695,7 @@
       <w:tr>
         <w:tc>
           <w:tcPr>
-            <w:tcW w:w="1514" w:type="dxa"/>
+            <w:tcW w:w="3510" w:type="dxa"/>
           </w:tcPr>
           <w:p>
             <w:pPr>
@@ -721,7 +721,7 @@
         </w:tc>
         <w:tc>
           <w:tcPr>
-            <w:tcW w:w="3181" w:type="dxa"/>
+            <w:tcW w:w="1276" w:type="dxa"/>
             <w:vAlign w:val="center"/>
           </w:tcPr>
           <w:p>
@@ -745,7 +745,7 @@
         </w:tc>
         <w:tc>
           <w:tcPr>
-            <w:tcW w:w="1750" w:type="dxa"/>
+            <w:tcW w:w="3402" w:type="dxa"/>
           </w:tcPr>
           <w:p>
             <w:pPr>
@@ -771,7 +771,7 @@
         </w:tc>
         <w:tc>
           <w:tcPr>
-            <w:tcW w:w="3331" w:type="dxa"/>
+            <w:tcW w:w="1588" w:type="dxa"/>
           </w:tcPr>
           <w:p>
             <w:pPr>
@@ -796,7 +796,7 @@
       <w:tr>
         <w:tc>
           <w:tcPr>
-            <w:tcW w:w="1514" w:type="dxa"/>
+            <w:tcW w:w="3510" w:type="dxa"/>
           </w:tcPr>
           <w:p>
             <w:pPr>
@@ -822,7 +822,7 @@
         </w:tc>
         <w:tc>
           <w:tcPr>
-            <w:tcW w:w="3181" w:type="dxa"/>
+            <w:tcW w:w="1276" w:type="dxa"/>
           </w:tcPr>
           <w:p>
             <w:pPr>
@@ -845,7 +845,7 @@
         </w:tc>
         <w:tc>
           <w:tcPr>
-            <w:tcW w:w="1750" w:type="dxa"/>
+            <w:tcW w:w="3402" w:type="dxa"/>
           </w:tcPr>
           <w:p>
             <w:pPr>
@@ -886,7 +886,7 @@
         </w:tc>
         <w:tc>
           <w:tcPr>
-            <w:tcW w:w="3331" w:type="dxa"/>
+            <w:tcW w:w="1588" w:type="dxa"/>
           </w:tcPr>
           <w:p>
             <w:pPr>
@@ -1517,20 +1517,20 @@
           <w:p>
             <w:pPr>
               <w:pStyle w:val="NoSpacing"/>
-              <w:jc w:val="right"/>
-              <w:rPr>
-                <w:sz w:val="18"/>
-                <w:szCs w:val="18"/>
-                <w:lang w:val="en-US"/>
-              </w:rPr>
-            </w:pPr>
-            <w:r>
-              <w:rPr>
-                <w:sz w:val="18"/>
-                <w:szCs w:val="18"/>
-                <w:lang w:val="en-US"/>
-              </w:rPr>
-              <w:t>${KETERANGAN}</w:t>
+              <w:jc w:val="center"/>
+              <w:rPr>
+                <w:sz w:val="18"/>
+                <w:szCs w:val="18"/>
+                <w:lang w:val="en-US"/>
+              </w:rPr>
+            </w:pPr>
+            <w:r>
+              <w:rPr>
+                <w:sz w:val="18"/>
+                <w:szCs w:val="18"/>
+                <w:lang w:val="en-US"/>
+              </w:rPr>
+              <w:t>${KET_N2}</w:t>
             </w:r>
           </w:p>
         </w:tc>
@@ -1637,19 +1637,19 @@
           <w:p>
             <w:pPr>
               <w:pStyle w:val="NoSpacing"/>
-              <w:jc w:val="right"/>
-              <w:rPr>
-                <w:sz w:val="18"/>
-                <w:szCs w:val="18"/>
-              </w:rPr>
-            </w:pPr>
-            <w:r>
-              <w:rPr>
-                <w:sz w:val="18"/>
-                <w:szCs w:val="18"/>
-                <w:lang w:val="en-US"/>
-              </w:rPr>
-              <w:t>${KETERANGAN}</w:t>
+              <w:jc w:val="center"/>
+              <w:rPr>
+                <w:sz w:val="18"/>
+                <w:szCs w:val="18"/>
+              </w:rPr>
+            </w:pPr>
+            <w:r>
+              <w:rPr>
+                <w:sz w:val="18"/>
+                <w:szCs w:val="18"/>
+                <w:lang w:val="en-US"/>
+              </w:rPr>
+              <w:t>${KET_N1}</w:t>
             </w:r>
           </w:p>
         </w:tc>
@@ -1704,9 +1704,6 @@
         </w:tc>
       </w:tr>
       <w:tr>
-        <w:trPr>
-          <w:trHeight w:val="389"/>
-        </w:trPr>
         <w:tc>
           <w:tcPr>
             <w:tcW w:w="725" w:type="dxa"/>
@@ -1773,7 +1770,7 @@
                 <w:szCs w:val="18"/>
                 <w:lang w:val="en-US"/>
               </w:rPr>
-              <w:t>${KETERANGAN}</w:t>
+              <w:t>${KET_N}</w:t>
             </w:r>
           </w:p>
         </w:tc>
@@ -1847,10 +1844,10 @@
         <w:tblLook w:val="04A0" w:firstRow="1" w:lastRow="0" w:firstColumn="1" w:lastColumn="0" w:noHBand="0" w:noVBand="1"/>
       </w:tblPr>
       <w:tblGrid>
-        <w:gridCol w:w="2632"/>
-        <w:gridCol w:w="3005"/>
-        <w:gridCol w:w="113"/>
-        <w:gridCol w:w="741"/>
+        <w:gridCol w:w="2915"/>
+        <w:gridCol w:w="2693"/>
+        <w:gridCol w:w="29"/>
+        <w:gridCol w:w="854"/>
         <w:gridCol w:w="3285"/>
       </w:tblGrid>
       <w:tr>
@@ -1886,7 +1883,7 @@
         <w:tc>
           <w:tcPr>
             <w:tcW w:w="5637" w:type="dxa"/>
-            <w:gridSpan w:val="2"/>
+            <w:gridSpan w:val="3"/>
           </w:tcPr>
           <w:p>
             <w:pPr>
@@ -1910,7 +1907,6 @@
         <w:tc>
           <w:tcPr>
             <w:tcW w:w="854" w:type="dxa"/>
-            <w:gridSpan w:val="2"/>
           </w:tcPr>
           <w:p>
             <w:pPr>
@@ -1957,23 +1953,23 @@
         <w:tc>
           <w:tcPr>
             <w:tcW w:w="5637" w:type="dxa"/>
+            <w:gridSpan w:val="3"/>
+          </w:tcPr>
+          <w:p>
+            <w:pPr>
+              <w:pStyle w:val="NoSpacing"/>
+              <w:jc w:val="center"/>
+              <w:rPr>
+                <w:sz w:val="18"/>
+                <w:szCs w:val="18"/>
+              </w:rPr>
+            </w:pPr>
+          </w:p>
+        </w:tc>
+        <w:tc>
+          <w:tcPr>
+            <w:tcW w:w="4139" w:type="dxa"/>
             <w:gridSpan w:val="2"/>
-          </w:tcPr>
-          <w:p>
-            <w:pPr>
-              <w:pStyle w:val="NoSpacing"/>
-              <w:jc w:val="center"/>
-              <w:rPr>
-                <w:sz w:val="18"/>
-                <w:szCs w:val="18"/>
-              </w:rPr>
-            </w:pPr>
-          </w:p>
-        </w:tc>
-        <w:tc>
-          <w:tcPr>
-            <w:tcW w:w="4139" w:type="dxa"/>
-            <w:gridSpan w:val="3"/>
           </w:tcPr>
           <w:p>
             <w:pPr>
@@ -2099,7 +2095,7 @@
       <w:tr>
         <w:tc>
           <w:tcPr>
-            <w:tcW w:w="2632" w:type="dxa"/>
+            <w:tcW w:w="2915" w:type="dxa"/>
           </w:tcPr>
           <w:p>
             <w:pPr>
@@ -2120,8 +2116,7 @@
         </w:tc>
         <w:tc>
           <w:tcPr>
-            <w:tcW w:w="3118" w:type="dxa"/>
-            <w:gridSpan w:val="2"/>
+            <w:tcW w:w="2693" w:type="dxa"/>
           </w:tcPr>
           <w:p>
             <w:pPr>
@@ -2142,8 +2137,8 @@
         </w:tc>
         <w:tc>
           <w:tcPr>
-            <w:tcW w:w="4026" w:type="dxa"/>
-            <w:gridSpan w:val="2"/>
+            <w:tcW w:w="4168" w:type="dxa"/>
+            <w:gridSpan w:val="3"/>
           </w:tcPr>
           <w:p>
             <w:pPr>
@@ -2166,7 +2161,7 @@
       <w:tr>
         <w:tc>
           <w:tcPr>
-            <w:tcW w:w="2632" w:type="dxa"/>
+            <w:tcW w:w="2915" w:type="dxa"/>
           </w:tcPr>
           <w:p>
             <w:pPr>
@@ -2187,8 +2182,7 @@
         </w:tc>
         <w:tc>
           <w:tcPr>
-            <w:tcW w:w="3118" w:type="dxa"/>
-            <w:gridSpan w:val="2"/>
+            <w:tcW w:w="2693" w:type="dxa"/>
           </w:tcPr>
           <w:p>
             <w:pPr>
@@ -2209,8 +2203,8 @@
         </w:tc>
         <w:tc>
           <w:tcPr>
-            <w:tcW w:w="4026" w:type="dxa"/>
-            <w:gridSpan w:val="2"/>
+            <w:tcW w:w="4168" w:type="dxa"/>
+            <w:gridSpan w:val="3"/>
           </w:tcPr>
           <w:p>
             <w:pPr>
@@ -2470,9 +2464,9 @@
         <w:tblLook w:val="04A0" w:firstRow="1" w:lastRow="0" w:firstColumn="1" w:lastColumn="0" w:noHBand="0" w:noVBand="1"/>
       </w:tblPr>
       <w:tblGrid>
-        <w:gridCol w:w="2689"/>
-        <w:gridCol w:w="3118"/>
-        <w:gridCol w:w="3969"/>
+        <w:gridCol w:w="2972"/>
+        <w:gridCol w:w="2693"/>
+        <w:gridCol w:w="4111"/>
       </w:tblGrid>
       <w:tr>
         <w:tc>
@@ -2506,7 +2500,7 @@
       <w:tr>
         <w:tc>
           <w:tcPr>
-            <w:tcW w:w="2689" w:type="dxa"/>
+            <w:tcW w:w="2972" w:type="dxa"/>
           </w:tcPr>
           <w:p>
             <w:pPr>
@@ -2527,7 +2521,7 @@
         </w:tc>
         <w:tc>
           <w:tcPr>
-            <w:tcW w:w="3118" w:type="dxa"/>
+            <w:tcW w:w="2693" w:type="dxa"/>
           </w:tcPr>
           <w:p>
             <w:pPr>
@@ -2548,7 +2542,7 @@
         </w:tc>
         <w:tc>
           <w:tcPr>
-            <w:tcW w:w="3969" w:type="dxa"/>
+            <w:tcW w:w="4111" w:type="dxa"/>
           </w:tcPr>
           <w:p>
             <w:pPr>
@@ -2571,7 +2565,7 @@
       <w:tr>
         <w:tc>
           <w:tcPr>
-            <w:tcW w:w="2689" w:type="dxa"/>
+            <w:tcW w:w="2972" w:type="dxa"/>
           </w:tcPr>
           <w:p>
             <w:pPr>
@@ -2592,7 +2586,7 @@
         </w:tc>
         <w:tc>
           <w:tcPr>
-            <w:tcW w:w="3118" w:type="dxa"/>
+            <w:tcW w:w="2693" w:type="dxa"/>
           </w:tcPr>
           <w:p>
             <w:pPr>
@@ -2613,7 +2607,7 @@
         </w:tc>
         <w:tc>
           <w:tcPr>
-            <w:tcW w:w="3969" w:type="dxa"/>
+            <w:tcW w:w="4111" w:type="dxa"/>
           </w:tcPr>
           <w:p>
             <w:pPr>

</xml_diff>